<commit_message>
Property market snapshot 2026-09-29
</commit_message>
<xml_diff>
--- a/data/Lagos_Property_Market_Intelligence_2026-09-29.docx
+++ b/data/Lagos_Property_Market_Intelligence_2026-09-29.docx
@@ -95,7 +95,7 @@
           </w:tcPr>
           <w:p>
             <w:r>
-              <w:t>175</w:t>
+              <w:t>176</w:t>
             </w:r>
           </w:p>
         </w:tc>
@@ -105,7 +105,7 @@
           </w:tcPr>
           <w:p>
             <w:r>
-              <w:t>↓ 24.6%</w:t>
+              <w:t>↓ 24.1%</w:t>
             </w:r>
           </w:p>
         </w:tc>
@@ -191,7 +191,7 @@
           </w:tcPr>
           <w:p>
             <w:r>
-              <w:t>44</w:t>
+              <w:t>1</w:t>
             </w:r>
           </w:p>
         </w:tc>
@@ -223,7 +223,7 @@
           </w:tcPr>
           <w:p>
             <w:r>
-              <w:t>14</w:t>
+              <w:t>0</w:t>
             </w:r>
           </w:p>
         </w:tc>
@@ -255,7 +255,7 @@
           </w:tcPr>
           <w:p>
             <w:r>
-              <w:t>17</w:t>
+              <w:t>2</w:t>
             </w:r>
           </w:p>
         </w:tc>
@@ -287,7 +287,7 @@
           </w:tcPr>
           <w:p>
             <w:r>
-              <w:t>₦800,000,000</w:t>
+              <w:t>₦825,000,000</w:t>
             </w:r>
           </w:p>
         </w:tc>
@@ -297,7 +297,7 @@
           </w:tcPr>
           <w:p>
             <w:r>
-              <w:t>↑ 14.3%</w:t>
+              <w:t>↑ 17.9%</w:t>
             </w:r>
           </w:p>
         </w:tc>
@@ -319,7 +319,7 @@
           </w:tcPr>
           <w:p>
             <w:r>
-              <w:t>₦20,000,000</w:t>
+              <w:t>₦19,000,000</w:t>
             </w:r>
           </w:p>
         </w:tc>
@@ -329,7 +329,7 @@
           </w:tcPr>
           <w:p>
             <w:r>
-              <w:t>→ 0.0%</w:t>
+              <w:t>↓ 5.0%</w:t>
             </w:r>
           </w:p>
         </w:tc>
@@ -377,12 +377,12 @@
     </w:p>
     <w:p>
       <w:r>
-        <w:t>Median apartment asking sale price increased 14.3% week on week.</w:t>
+        <w:t>Median apartment asking sale price increased 17.9% week on week.</w:t>
       </w:r>
     </w:p>
     <w:p>
       <w:r>
-        <w:t>Median annual apartment rent held 0.0% week on week.</w:t>
+        <w:t>Median annual apartment rent decreased 5.0% week on week.</w:t>
       </w:r>
     </w:p>
     <w:p>
@@ -392,7 +392,7 @@
     </w:p>
     <w:p>
       <w:r>
-        <w:t>The scan captured 57 fewer comparable listings than the previous snapshot.</w:t>
+        <w:t>The scan captured 56 fewer comparable listings than the previous snapshot.</w:t>
       </w:r>
     </w:p>
     <w:p>
@@ -485,7 +485,7 @@
     </w:p>
     <w:p>
       <w:r>
-        <w:t>Old Ikoyi: 36 comparables; 3BR sale ₦950,000,000; 3BR rent ₦50,000,000; sale ₦/sqm ₦2,000,000; land ₦/sqm ₦5,000,000.</w:t>
+        <w:t>Old Ikoyi: 37 comparables; 3BR sale ₦950,000,000; 3BR rent ₦50,000,000; sale ₦/sqm ₦2,000,000; land ₦/sqm ₦5,000,000.</w:t>
       </w:r>
     </w:p>
     <w:p>
@@ -505,12 +505,12 @@
     </w:p>
     <w:p>
       <w:r>
-        <w:t>Asokoro: 21 comparables; 3BR sale ₦50,165,000; 3BR rent ₦8,000,000; sale ₦/sqm N/A; land ₦/sqm ₦78,947.</w:t>
+        <w:t>Asokoro: 19 comparables; 3BR sale ₦152,500,000; 3BR rent ₦8,000,000; sale ₦/sqm N/A; land ₦/sqm ₦78,947.</w:t>
       </w:r>
     </w:p>
     <w:p>
       <w:r>
-        <w:t>Maitama: 16 comparables; 3BR sale N/A; 3BR rent ₦30,000,000; sale ₦/sqm N/A; land ₦/sqm ₦1,200,000.</w:t>
+        <w:t>Maitama: 18 comparables; 3BR sale N/A; 3BR rent ₦16,750,000; sale ₦/sqm N/A; land ₦/sqm ₦1,200,000.</w:t>
       </w:r>
     </w:p>
     <w:p>
@@ -571,7 +571,7 @@
         <w:pStyle w:val="ListBullet"/>
       </w:pPr>
       <w:r>
-        <w:t>Asokoro: sale -75.5%, rent -11.1%, land ₦/sqm -90.0%</w:t>
+        <w:t>Asokoro: sale -25.6%, rent -11.1%, land ₦/sqm -90.0%</w:t>
       </w:r>
     </w:p>
     <w:p>
@@ -579,7 +579,7 @@
         <w:pStyle w:val="ListBullet"/>
       </w:pPr>
       <w:r>
-        <w:t>Maitama: rent +20.0%, land ₦/sqm -34.0%</w:t>
+        <w:t>Maitama: rent -33.0%, land ₦/sqm -34.0%</w:t>
       </w:r>
     </w:p>
     <w:p>

</xml_diff>